<commit_message>
Remove non-deliverable working files; keep submission and analysis history
</commit_message>
<xml_diff>
--- a/Lab5_Static_Code_Analysis_Report.docx
+++ b/Lab5_Static_Code_Analysis_Report.docx
@@ -6188,7 +6188,7 @@
                 <w:b w:val="0"/>
                 <w:sz w:val="17"/>
               </w:rPr>
-              <w:t>reports/stages/</w:t>
+              <w:t>config.txt, users.txt</w:t>
             </w:r>
           </w:p>
         </w:tc>
@@ -6207,7 +6207,7 @@
                 <w:b w:val="0"/>
                 <w:sz w:val="17"/>
               </w:rPr>
-              <w:t>Intermediate reports after the Pylint fix and after the Bandit fix.</w:t>
+              <w:t>Sample data used to run the program end to end.</w:t>
             </w:r>
           </w:p>
         </w:tc>
@@ -6226,7 +6226,7 @@
                 <w:b w:val="0"/>
                 <w:sz w:val="17"/>
               </w:rPr>
-              <w:t>Evidence</w:t>
+              <w:t>Support</w:t>
             </w:r>
           </w:p>
         </w:tc>
@@ -6251,7 +6251,7 @@
                 <w:b w:val="0"/>
                 <w:sz w:val="17"/>
               </w:rPr>
-              <w:t>config.txt, users.txt</w:t>
+              <w:t>Lab5_Static_Code_Analysis_Report.docx</w:t>
             </w:r>
           </w:p>
         </w:tc>
@@ -6271,7 +6271,7 @@
                 <w:b w:val="0"/>
                 <w:sz w:val="17"/>
               </w:rPr>
-              <w:t>Sample data used to run the program end to end.</w:t>
+              <w:t>This document: issue table, fixes, verification and reflection.</w:t>
             </w:r>
           </w:p>
         </w:tc>
@@ -6291,196 +6291,7 @@
                 <w:b w:val="0"/>
                 <w:sz w:val="17"/>
               </w:rPr>
-              <w:t>Support</w:t>
-            </w:r>
-          </w:p>
-        </w:tc>
-      </w:tr>
-      <w:tr>
-        <w:trPr>
-          <w:cantSplit/>
-        </w:trPr>
-        <w:tc>
-          <w:tcPr>
-            <w:tcW w:type="dxa" w:w="3402"/>
-          </w:tcPr>
-          <w:p>
-            <w:pPr>
-              <w:spacing w:before="20" w:after="20" w:line="240" w:lineRule="auto"/>
-            </w:pPr>
-            <w:r/>
-            <w:r>
-              <w:rPr>
-                <w:rFonts w:ascii="Calibri" w:hAnsi="Calibri"/>
-                <w:b w:val="0"/>
-                <w:sz w:val="17"/>
-              </w:rPr>
-              <w:t>Lab5_Static_Code_Analysis_Report.docx</w:t>
-            </w:r>
-          </w:p>
-        </w:tc>
-        <w:tc>
-          <w:tcPr>
-            <w:tcW w:type="dxa" w:w="4422"/>
-          </w:tcPr>
-          <w:p>
-            <w:pPr>
-              <w:spacing w:before="20" w:after="20" w:line="240" w:lineRule="auto"/>
-            </w:pPr>
-            <w:r/>
-            <w:r>
-              <w:rPr>
-                <w:rFonts w:ascii="Calibri" w:hAnsi="Calibri"/>
-                <w:b w:val="0"/>
-                <w:sz w:val="17"/>
-              </w:rPr>
-              <w:t>This document: issue table, fixes, verification and reflection.</w:t>
-            </w:r>
-          </w:p>
-        </w:tc>
-        <w:tc>
-          <w:tcPr>
-            <w:tcW w:type="dxa" w:w="1814"/>
-          </w:tcPr>
-          <w:p>
-            <w:pPr>
-              <w:spacing w:before="20" w:after="20" w:line="240" w:lineRule="auto"/>
-            </w:pPr>
-            <w:r/>
-            <w:r>
-              <w:rPr>
-                <w:rFonts w:ascii="Calibri" w:hAnsi="Calibri"/>
-                <w:b w:val="0"/>
-                <w:sz w:val="17"/>
-              </w:rPr>
               <w:t>Deliverable 3</w:t>
-            </w:r>
-          </w:p>
-        </w:tc>
-      </w:tr>
-      <w:tr>
-        <w:trPr>
-          <w:cantSplit/>
-        </w:trPr>
-        <w:tc>
-          <w:tcPr>
-            <w:tcW w:type="dxa" w:w="3402"/>
-            <w:shd w:val="clear" w:color="auto" w:fill="F2F5FA"/>
-          </w:tcPr>
-          <w:p>
-            <w:pPr>
-              <w:spacing w:before="20" w:after="20" w:line="240" w:lineRule="auto"/>
-            </w:pPr>
-            <w:r/>
-            <w:r>
-              <w:rPr>
-                <w:rFonts w:ascii="Calibri" w:hAnsi="Calibri"/>
-                <w:b w:val="0"/>
-                <w:sz w:val="17"/>
-              </w:rPr>
-              <w:t>build_report.py</w:t>
-            </w:r>
-          </w:p>
-        </w:tc>
-        <w:tc>
-          <w:tcPr>
-            <w:tcW w:type="dxa" w:w="4422"/>
-            <w:shd w:val="clear" w:color="auto" w:fill="F2F5FA"/>
-          </w:tcPr>
-          <w:p>
-            <w:pPr>
-              <w:spacing w:before="20" w:after="20" w:line="240" w:lineRule="auto"/>
-            </w:pPr>
-            <w:r/>
-            <w:r>
-              <w:rPr>
-                <w:rFonts w:ascii="Calibri" w:hAnsi="Calibri"/>
-                <w:b w:val="0"/>
-                <w:sz w:val="17"/>
-              </w:rPr>
-              <w:t>Script that regenerates this DOCX from the reports and fixed data.</w:t>
-            </w:r>
-          </w:p>
-        </w:tc>
-        <w:tc>
-          <w:tcPr>
-            <w:tcW w:type="dxa" w:w="1814"/>
-            <w:shd w:val="clear" w:color="auto" w:fill="F2F5FA"/>
-          </w:tcPr>
-          <w:p>
-            <w:pPr>
-              <w:spacing w:before="20" w:after="20" w:line="240" w:lineRule="auto"/>
-            </w:pPr>
-            <w:r/>
-            <w:r>
-              <w:rPr>
-                <w:rFonts w:ascii="Calibri" w:hAnsi="Calibri"/>
-                <w:b w:val="0"/>
-                <w:sz w:val="17"/>
-              </w:rPr>
-              <w:t>Support</w:t>
-            </w:r>
-          </w:p>
-        </w:tc>
-      </w:tr>
-      <w:tr>
-        <w:trPr>
-          <w:cantSplit/>
-        </w:trPr>
-        <w:tc>
-          <w:tcPr>
-            <w:tcW w:type="dxa" w:w="3402"/>
-          </w:tcPr>
-          <w:p>
-            <w:pPr>
-              <w:spacing w:before="20" w:after="20" w:line="240" w:lineRule="auto"/>
-            </w:pPr>
-            <w:r/>
-            <w:r>
-              <w:rPr>
-                <w:rFonts w:ascii="Calibri" w:hAnsi="Calibri"/>
-                <w:b w:val="0"/>
-                <w:sz w:val="17"/>
-              </w:rPr>
-              <w:t>README.md</w:t>
-            </w:r>
-          </w:p>
-        </w:tc>
-        <w:tc>
-          <w:tcPr>
-            <w:tcW w:type="dxa" w:w="4422"/>
-          </w:tcPr>
-          <w:p>
-            <w:pPr>
-              <w:spacing w:before="20" w:after="20" w:line="240" w:lineRule="auto"/>
-            </w:pPr>
-            <w:r/>
-            <w:r>
-              <w:rPr>
-                <w:rFonts w:ascii="Calibri" w:hAnsi="Calibri"/>
-                <w:b w:val="0"/>
-                <w:sz w:val="17"/>
-              </w:rPr>
-              <w:t>One-page guide to the repository and the exact commands used.</w:t>
-            </w:r>
-          </w:p>
-        </w:tc>
-        <w:tc>
-          <w:tcPr>
-            <w:tcW w:type="dxa" w:w="1814"/>
-          </w:tcPr>
-          <w:p>
-            <w:pPr>
-              <w:spacing w:before="20" w:after="20" w:line="240" w:lineRule="auto"/>
-            </w:pPr>
-            <w:r/>
-            <w:r>
-              <w:rPr>
-                <w:rFonts w:ascii="Calibri" w:hAnsi="Calibri"/>
-                <w:b w:val="0"/>
-                <w:sz w:val="17"/>
-              </w:rPr>
-              <w:t>Support</w:t>
             </w:r>
           </w:p>
         </w:tc>
@@ -6739,42 +6550,6 @@
                 <w:sz w:val="16"/>
               </w:rPr>
               <w:t>git log --oneline</w:t>
-            </w:r>
-          </w:p>
-          <w:p>
-            <w:pPr>
-              <w:spacing w:before="0" w:after="0" w:line="240" w:lineRule="auto"/>
-            </w:pPr>
-            <w:r>
-              <w:rPr>
-                <w:rFonts w:ascii="Consolas" w:hAnsi="Consolas"/>
-                <w:sz w:val="16"/>
-              </w:rPr>
-              <w:t xml:space="preserve"> </w:t>
-            </w:r>
-          </w:p>
-          <w:p>
-            <w:pPr>
-              <w:spacing w:before="0" w:after="0" w:line="240" w:lineRule="auto"/>
-            </w:pPr>
-            <w:r>
-              <w:rPr>
-                <w:rFonts w:ascii="Consolas" w:hAnsi="Consolas"/>
-                <w:sz w:val="16"/>
-              </w:rPr>
-              <w:t># 5. rebuild this report</w:t>
-            </w:r>
-          </w:p>
-          <w:p>
-            <w:pPr>
-              <w:spacing w:before="0" w:after="0" w:line="240" w:lineRule="auto"/>
-            </w:pPr>
-            <w:r>
-              <w:rPr>
-                <w:rFonts w:ascii="Consolas" w:hAnsi="Consolas"/>
-                <w:sz w:val="16"/>
-              </w:rPr>
-              <w:t>python build_report.py</w:t>
             </w:r>
           </w:p>
         </w:tc>

</xml_diff>